<commit_message>
replace report screenshots with full UI captures
</commit_message>
<xml_diff>
--- a/Informe_Visión_en_Capas.docx
+++ b/Informe_Visión_en_Capas.docx
@@ -161,7 +161,7 @@
       <w:r>
         <w:drawing>
           <wp:inline xmlns:a="http://schemas.openxmlformats.org/drawingml/2006/main" xmlns:pic="http://schemas.openxmlformats.org/drawingml/2006/picture">
-            <wp:extent cx="5806440" cy="3388373"/>
+            <wp:extent cx="5806440" cy="3810476"/>
             <wp:docPr id="5" name="Picture 5"/>
             <wp:cNvGraphicFramePr>
               <a:graphicFrameLocks noChangeAspect="1"/>
@@ -170,7 +170,7 @@
               <a:graphicData uri="http://schemas.openxmlformats.org/drawingml/2006/picture">
                 <pic:pic>
                   <pic:nvPicPr>
-                    <pic:cNvPr id="0" name="app_real.png"/>
+                    <pic:cNvPr id="0" name="app_clean_overview.png"/>
                     <pic:cNvPicPr/>
                   </pic:nvPicPr>
                   <pic:blipFill>
@@ -182,7 +182,7 @@
                   <pic:spPr>
                     <a:xfrm>
                       <a:off x="0" y="0"/>
-                      <a:ext cx="5806440" cy="3388373"/>
+                      <a:ext cx="5806440" cy="3810476"/>
                     </a:xfrm>
                     <a:prstGeom prst="rect"/>
                   </pic:spPr>
@@ -204,7 +204,7 @@
           <w:color w:val="52525F"/>
           <w:sz w:val="18"/>
         </w:rPr>
-        <w:t>Figura 6. Captura real de la interfaz Streamlit y del componente de carga.</w:t>
+        <w:t>Figura 6. Captura real de la interfaz Streamlit con el componente de carga visible.</w:t>
       </w:r>
     </w:p>
     <w:p>
@@ -258,7 +258,7 @@
           <w:color w:val="52525F"/>
           <w:sz w:val="18"/>
         </w:rPr>
-        <w:t>Figura 7. Captura real de la página durante la ejecución del prototipo en una vista amplia.</w:t>
+        <w:t>Figura 7. Captura real de la aplicación en una vista amplia durante su ejecución.</w:t>
       </w:r>
     </w:p>
     <w:sectPr>

</xml_diff>